<commit_message>
feat(national): 12書類動的フォーム UI + value-before-label 18件修正
Task 1: value-before-label 18件解消
- Cat A (13件 シンプル swap): {{var}}<label> → <label>{{var}}
- Cat B (5件 multi-node): 申請者ブロックに submitterAddress/Phone/Name 正常挿入
- 検証: compare-layout B: 18 → 0 (false positive 5 件は detector 厳密化で除外)
- 5書類に submitterAddress 追加 (フォーム UX)

Task 2: 12 公式テンプレ書類の動的フォーム UI
- templates-official-metadata.ts: pack 別 section/field 定義
- national-form-official.tsx: RHF + Zod + 動的 schema 生成
- [docType]/page.tsx: 公式テンプレ pack は新フォーム、それ以外は既存 (並行運用)
- モバイル対応: font 16px (iOS zoom 防止), 44px タップターゲット, 単列→2列 grid
- 任意項目に「（任意）」表示、エラー時は最初のエラー field に focus+scroll
- metadata-coverage.test.ts: 12 pack × 2 = 24 テストで meta ⇔ docx 整合性保証

依存追加: react-hook-form, @hookform/resolvers

検証:
- typecheck clean / build success
- test: 179 passed (24 new metadata-coverage)
- verify-no-blanks: 12書類すべて 0 blank 維持
- compare-layout: A=0, B=0, D=0 (C=24 は本 PR スコープ外)

Co-Authored-By: Claude Opus 4.7 (1M context) <noreply@anthropic.com>
</commit_message>
<xml_diff>
--- a/lib/engine-v2/national/templates-official/hazmat-comprehensive-safety-supervisor.docx
+++ b/lib/engine-v2/national/templates-official/hazmat-comprehensive-safety-supervisor.docx
@@ -240,41 +240,7 @@
                 <w:u w:val="single"/>
                 <w:lang w:eastAsia="zh-TW"/>
               </w:rPr>
-              <w:t>住　所</w:t>
-            </w:r>
-            <w:r>
-              <w:rPr>
-                <w:color w:val="000000"/>
-                <w:u w:val="single"/>
-                <w:lang w:eastAsia="zh-TW"/>
-              </w:rPr>
-              <w:t xml:space="preserve">          </w:t>
-            </w:r>
-            <w:r>
-              <w:rPr>
-                <w:rFonts w:hint="eastAsia"/>
-                <w:color w:val="000000"/>
-                <w:u w:val="single"/>
-                <w:lang w:eastAsia="zh-TW"/>
-              </w:rPr>
-              <w:t xml:space="preserve">　　　　　</w:t>
-            </w:r>
-            <w:r>
-              <w:rPr>
-                <w:color w:val="000000"/>
-                <w:u w:val="single"/>
-                <w:lang w:eastAsia="zh-TW"/>
-              </w:rPr>
-              <w:t xml:space="preserve">   </w:t>
-            </w:r>
-            <w:r>
-              <w:rPr>
-                <w:rFonts w:hint="eastAsia"/>
-                <w:color w:val="000000"/>
-                <w:u w:val="single"/>
-                <w:lang w:eastAsia="zh-TW"/>
-              </w:rPr>
-              <w:t xml:space="preserve">（電話　{{submitterPhone}}）</w:t>
+              <w:t xml:space="preserve">住　所　{{submitterAddress}}　（電話　{{submitterPhone}}）</w:t>
             </w:r>
           </w:p>
           <w:p>

</xml_diff>